<commit_message>
docs(prd): add Phase 1.7 — School-Day Awareness section
Reflects shipped work in this checkpoint cycle:
- US-2.3.7 RoutineStep.school_day_only flag with weekend/holiday/closure suppression
- school_closures table + admin CRUD
- holiday_country/holiday_subdiv settings + GET /api/admin/holiday-options
- Splash + Home banner + 'all done' celebratory card
- Profile-colored streak chip on Splash
- Per-step + bulk school-day-only toggle in routine editor

Updates: §2.3 user stories, §3.1 settings JSON, §4.1 entities,
§5.3 endpoints, §9 phases, §10 glossary. .docx regenerated.

Co-authored-by: Copilot <223556219+Copilot@users.noreply.github.com>
</commit_message>
<xml_diff>
--- a/PRD_Family_Hub_Display_v2.docx
+++ b/PRD_Family_Hub_Display_v2.docx
@@ -2708,6 +2708,173 @@
       </w:r>
     </w:p>
     <w:p>
+      <w:r>
+        <w:rPr>
+          <w:b/>
+        </w:rPr>
+        <w:t>US-2.3.7: School-Day Awareness</w:t>
+      </w:r>
+    </w:p>
+    <w:p>
+      <w:pPr>
+        <w:ind w:left="360"/>
+      </w:pPr>
+      <w:r>
+        <w:rPr>
+          <w:i/>
+        </w:rPr>
+        <w:t>"On a snow day or federal holiday, the 'pack backpack' part of the morning routine should disappear — but brushing teeth and getting dressed still apply."</w:t>
+      </w:r>
+    </w:p>
+    <w:p>
+      <w:pPr>
+        <w:pStyle w:val="ListBullet"/>
+      </w:pPr>
+      <w:r>
+        <w:t xml:space="preserve">Each </w:t>
+      </w:r>
+      <w:r>
+        <w:rPr>
+          <w:rFonts w:ascii="Courier New" w:hAnsi="Courier New"/>
+          <w:sz w:val="20"/>
+        </w:rPr>
+        <w:t>RoutineStep</w:t>
+      </w:r>
+      <w:r>
+        <w:t xml:space="preserve"> carries a </w:t>
+      </w:r>
+      <w:r>
+        <w:rPr>
+          <w:rFonts w:ascii="Courier New" w:hAnsi="Courier New"/>
+          <w:sz w:val="20"/>
+        </w:rPr>
+        <w:t>school_day_only: bool</w:t>
+      </w:r>
+      <w:r>
+        <w:t xml:space="preserve"> flag (default </w:t>
+      </w:r>
+      <w:r>
+        <w:rPr>
+          <w:rFonts w:ascii="Courier New" w:hAnsi="Courier New"/>
+          <w:sz w:val="20"/>
+        </w:rPr>
+        <w:t>false</w:t>
+      </w:r>
+      <w:r>
+        <w:t xml:space="preserve">). When </w:t>
+      </w:r>
+      <w:r>
+        <w:rPr>
+          <w:rFonts w:ascii="Courier New" w:hAnsi="Courier New"/>
+          <w:sz w:val="20"/>
+        </w:rPr>
+        <w:t>true</w:t>
+      </w:r>
+      <w:r>
+        <w:t>, the step is suppressed on weekends, US federal holidays (or whichever calendar the household has selected — see §3.1), and admin-marked closures.</w:t>
+      </w:r>
+    </w:p>
+    <w:p>
+      <w:pPr>
+        <w:pStyle w:val="ListBullet"/>
+      </w:pPr>
+      <w:r>
+        <w:t xml:space="preserve">Closures are persisted in a </w:t>
+      </w:r>
+      <w:r>
+        <w:rPr>
+          <w:rFonts w:ascii="Courier New" w:hAnsi="Courier New"/>
+          <w:sz w:val="20"/>
+        </w:rPr>
+        <w:t>school_closures</w:t>
+      </w:r>
+      <w:r>
+        <w:t xml:space="preserve"> table (one row per non-school date, with optional reason like "Snow day" or "Teacher in-service"), managed from a Settings panel section.</w:t>
+      </w:r>
+    </w:p>
+    <w:p>
+      <w:pPr>
+        <w:pStyle w:val="ListBullet"/>
+      </w:pPr>
+      <w:r>
+        <w:t xml:space="preserve">A routine whose only remaining applicable steps are all </w:t>
+      </w:r>
+      <w:r>
+        <w:rPr>
+          <w:rFonts w:ascii="Courier New" w:hAnsi="Courier New"/>
+          <w:sz w:val="20"/>
+        </w:rPr>
+        <w:t>school_day_only</w:t>
+      </w:r>
+      <w:r>
+        <w:t xml:space="preserve"> on a non-school day is treated as "no applicable steps today": it does not appear on Splash/Home, and the streak walk-back treats the day as non-scheduled (the streak is preserved, never extended).</w:t>
+      </w:r>
+    </w:p>
+    <w:p>
+      <w:pPr>
+        <w:pStyle w:val="ListBullet"/>
+      </w:pPr>
+      <w:r>
+        <w:t>Splash + Home show a small banner ("No school today — Martin Luther King Jr. Day · 3 school-day steps hidden") when a holiday or closure is active. Weekends never trigger the banner (they're already obvious).</w:t>
+      </w:r>
+    </w:p>
+    <w:p>
+      <w:pPr>
+        <w:pStyle w:val="ListBullet"/>
+      </w:pPr>
+      <w:r>
+        <w:t>The routine editor exposes a per-step "Only on school days" checkbox plus a one-click bulk toggle in the Steps section header that flips every step at once.</w:t>
+      </w:r>
+    </w:p>
+    <w:p>
+      <w:pPr>
+        <w:pStyle w:val="ListBullet"/>
+      </w:pPr>
+      <w:r>
+        <w:t xml:space="preserve">Holiday calendar source is admin-configurable via a Settings dropdown (country + optional state/region), backed by the Python </w:t>
+      </w:r>
+      <w:r>
+        <w:rPr>
+          <w:rFonts w:ascii="Courier New" w:hAnsi="Courier New"/>
+          <w:sz w:val="20"/>
+        </w:rPr>
+        <w:t>holidays</w:t>
+      </w:r>
+      <w:r>
+        <w:t xml:space="preserve"> package; defaults to </w:t>
+      </w:r>
+      <w:r>
+        <w:rPr>
+          <w:b/>
+        </w:rPr>
+        <w:t>US, federal-only</w:t>
+      </w:r>
+      <w:r>
+        <w:t xml:space="preserve"> for new households.</w:t>
+      </w:r>
+    </w:p>
+    <w:p>
+      <w:r>
+        <w:rPr>
+          <w:b/>
+        </w:rPr>
+        <w:t>Done means:</w:t>
+      </w:r>
+      <w:r>
+        <w:t xml:space="preserve"> with </w:t>
+      </w:r>
+      <w:r>
+        <w:rPr>
+          <w:rFonts w:ascii="Courier New" w:hAnsi="Courier New"/>
+          <w:sz w:val="20"/>
+        </w:rPr>
+        <w:t>holiday_country=US</w:t>
+      </w:r>
+      <w:r>
+        <w:t xml:space="preserve"> selected and a school routine that has "Brush teeth" (everyday) + "Pack backpack" (school-day only): on a regular Wednesday both steps appear; on Thanksgiving the routine still appears with just "Brush teeth"; on a snow day added via Settings the banner appears and "Pack backpack" is hidden; the kid's streak is unchanged either way.</w:t>
+      </w:r>
+    </w:p>
+    <w:p>
       <w:pPr>
         <w:pStyle w:val="Heading2"/>
       </w:pPr>
@@ -4763,7 +4930,33 @@
           <w:rFonts w:ascii="Courier New" w:hAnsi="Courier New"/>
           <w:sz w:val="20"/>
         </w:rPr>
-        <w:t xml:space="preserve">  "splash_show_messages": false</w:t>
+        <w:t xml:space="preserve">  "splash_show_messages": false,</w:t>
+      </w:r>
+    </w:p>
+    <w:p>
+      <w:r>
+        <w:rPr>
+          <w:rFonts w:ascii="Courier New" w:hAnsi="Courier New"/>
+          <w:sz w:val="20"/>
+        </w:rPr>
+      </w:r>
+    </w:p>
+    <w:p>
+      <w:r>
+        <w:rPr>
+          <w:rFonts w:ascii="Courier New" w:hAnsi="Courier New"/>
+          <w:sz w:val="20"/>
+        </w:rPr>
+        <w:t xml:space="preserve">  "holiday_country": "US",</w:t>
+      </w:r>
+    </w:p>
+    <w:p>
+      <w:r>
+        <w:rPr>
+          <w:rFonts w:ascii="Courier New" w:hAnsi="Courier New"/>
+          <w:sz w:val="20"/>
+        </w:rPr>
+        <w:t xml:space="preserve">  "holiday_subdiv": null</w:t>
       </w:r>
     </w:p>
     <w:p>
@@ -4884,6 +5077,61 @@
       </w:r>
     </w:p>
     <w:p>
+      <w:r>
+        <w:t xml:space="preserve">The </w:t>
+      </w:r>
+      <w:r>
+        <w:rPr>
+          <w:rFonts w:ascii="Courier New" w:hAnsi="Courier New"/>
+          <w:sz w:val="20"/>
+        </w:rPr>
+        <w:t>holiday_country</w:t>
+      </w:r>
+      <w:r>
+        <w:t xml:space="preserve"> (ISO 3166-1 alpha-2) and optional </w:t>
+      </w:r>
+      <w:r>
+        <w:rPr>
+          <w:rFonts w:ascii="Courier New" w:hAnsi="Courier New"/>
+          <w:sz w:val="20"/>
+        </w:rPr>
+        <w:t>holiday_subdiv</w:t>
+      </w:r>
+      <w:r>
+        <w:t xml:space="preserve"> (e.g. US state code </w:t>
+      </w:r>
+      <w:r>
+        <w:rPr>
+          <w:rFonts w:ascii="Courier New" w:hAnsi="Courier New"/>
+          <w:sz w:val="20"/>
+        </w:rPr>
+        <w:t>"MA"</w:t>
+      </w:r>
+      <w:r>
+        <w:t xml:space="preserve">) drive the school-day filter for </w:t>
+      </w:r>
+      <w:r>
+        <w:rPr>
+          <w:rFonts w:ascii="Courier New" w:hAnsi="Courier New"/>
+          <w:sz w:val="20"/>
+        </w:rPr>
+        <w:t>school_day_only</w:t>
+      </w:r>
+      <w:r>
+        <w:t xml:space="preserve"> routine steps (US-2.3.7). Editable from Settings via a dropdown sourced from </w:t>
+      </w:r>
+      <w:r>
+        <w:rPr>
+          <w:rFonts w:ascii="Courier New" w:hAnsi="Courier New"/>
+          <w:sz w:val="20"/>
+        </w:rPr>
+        <w:t>GET /api/admin/holiday-options</w:t>
+      </w:r>
+      <w:r>
+        <w:t>.</w:t>
+      </w:r>
+    </w:p>
+    <w:p>
       <w:pPr>
         <w:pStyle w:val="Heading2"/>
       </w:pPr>
@@ -5020,7 +5268,7 @@
           <w:rFonts w:ascii="Courier New" w:hAnsi="Courier New"/>
           <w:sz w:val="20"/>
         </w:rPr>
-        <w:t>├── Routine (name, time_block, days_of_week[], start_time, is_active)</w:t>
+        <w:t>├── Routine (name, time_block, days_of_week[], start_time, is_active, pausable_on_vacation)</w:t>
       </w:r>
     </w:p>
     <w:p>
@@ -5029,7 +5277,7 @@
           <w:rFonts w:ascii="Courier New" w:hAnsi="Courier New"/>
           <w:sz w:val="20"/>
         </w:rPr>
-        <w:t>│   ├── RoutineStep (label, icon, points_value, sort_order)</w:t>
+        <w:t>│   ├── RoutineStep (label, icon, points_value, sort_order, days_of_week[], school_day_only)</w:t>
       </w:r>
     </w:p>
     <w:p>
@@ -5038,7 +5286,25 @@
           <w:rFonts w:ascii="Courier New" w:hAnsi="Courier New"/>
           <w:sz w:val="20"/>
         </w:rPr>
-        <w:t>│   └── RoutineCompletion (profile_id, date, completed_steps[], is_fully_completed)</w:t>
+        <w:t>│   ├── RoutineCompletion (profile_id, date, completed_steps[], is_fully_completed)</w:t>
+      </w:r>
+    </w:p>
+    <w:p>
+      <w:r>
+        <w:rPr>
+          <w:rFonts w:ascii="Courier New" w:hAnsi="Courier New"/>
+          <w:sz w:val="20"/>
+        </w:rPr>
+        <w:t>│   └── RoutineOverride (kind, start_date, end_date, reason)   # routine_id NULL = household-wide</w:t>
+      </w:r>
+    </w:p>
+    <w:p>
+      <w:r>
+        <w:rPr>
+          <w:rFonts w:ascii="Courier New" w:hAnsi="Courier New"/>
+          <w:sz w:val="20"/>
+        </w:rPr>
+        <w:t>├── SchoolClosure (date, reason)</w:t>
       </w:r>
     </w:p>
     <w:p>
@@ -7561,6 +7827,91 @@
           <w:p>
             <w:r/>
             <w:r>
+              <w:t>GET</w:t>
+            </w:r>
+          </w:p>
+        </w:tc>
+        <w:tc>
+          <w:tcPr>
+            <w:tcW w:type="dxa" w:w="2880"/>
+          </w:tcPr>
+          <w:p>
+            <w:r/>
+            <w:r>
+              <w:rPr>
+                <w:rFonts w:ascii="Courier New" w:hAnsi="Courier New"/>
+                <w:sz w:val="20"/>
+              </w:rPr>
+              <w:t>/api/admin/holiday-options</w:t>
+            </w:r>
+          </w:p>
+        </w:tc>
+        <w:tc>
+          <w:tcPr>
+            <w:tcW w:type="dxa" w:w="2880"/>
+          </w:tcPr>
+          <w:p>
+            <w:r/>
+            <w:r>
+              <w:rPr>
+                <w:rFonts w:ascii="Courier New" w:hAnsi="Courier New"/>
+                <w:sz w:val="20"/>
+              </w:rPr>
+              <w:t>{countries: [CC], subdivisions: {CC: [SUB]}}</w:t>
+            </w:r>
+            <w:r>
+              <w:t xml:space="preserve"> for the holiday calendar picker (US-2.3.7). Cached.</w:t>
+            </w:r>
+          </w:p>
+        </w:tc>
+      </w:tr>
+      <w:tr>
+        <w:tc>
+          <w:tcPr>
+            <w:tcW w:type="dxa" w:w="2880"/>
+          </w:tcPr>
+          <w:p>
+            <w:r/>
+            <w:r>
+              <w:t>GET/POST/DELETE</w:t>
+            </w:r>
+          </w:p>
+        </w:tc>
+        <w:tc>
+          <w:tcPr>
+            <w:tcW w:type="dxa" w:w="2880"/>
+          </w:tcPr>
+          <w:p>
+            <w:r/>
+            <w:r>
+              <w:rPr>
+                <w:rFonts w:ascii="Courier New" w:hAnsi="Courier New"/>
+                <w:sz w:val="20"/>
+              </w:rPr>
+              <w:t>/api/admin/school-closures</w:t>
+            </w:r>
+          </w:p>
+        </w:tc>
+        <w:tc>
+          <w:tcPr>
+            <w:tcW w:type="dxa" w:w="2880"/>
+          </w:tcPr>
+          <w:p>
+            <w:r/>
+            <w:r>
+              <w:t>CRUD for admin-marked non-school dates (snow days, in-service days). See US-2.3.7.</w:t>
+            </w:r>
+          </w:p>
+        </w:tc>
+      </w:tr>
+      <w:tr>
+        <w:tc>
+          <w:tcPr>
+            <w:tcW w:type="dxa" w:w="2880"/>
+          </w:tcPr>
+          <w:p>
+            <w:r/>
+            <w:r>
               <w:t>PATCH</w:t>
             </w:r>
           </w:p>
@@ -9558,6 +9909,174 @@
         <w:pStyle w:val="Heading2"/>
       </w:pPr>
       <w:r>
+        <w:t>Phase 1.7 — School-Day Awareness ✅ shipped</w:t>
+      </w:r>
+    </w:p>
+    <w:p>
+      <w:pPr>
+        <w:pStyle w:val="ListBullet"/>
+      </w:pPr>
+      <w:r>
+        <w:t xml:space="preserve">☑ </w:t>
+      </w:r>
+      <w:r>
+        <w:rPr>
+          <w:rFonts w:ascii="Courier New" w:hAnsi="Courier New"/>
+          <w:sz w:val="20"/>
+        </w:rPr>
+        <w:t>RoutineStep.school_day_only</w:t>
+      </w:r>
+      <w:r>
+        <w:t xml:space="preserve"> flag (US-2.3.7) hides the step on weekends, holidays, and admin-marked closures</w:t>
+      </w:r>
+    </w:p>
+    <w:p>
+      <w:pPr>
+        <w:pStyle w:val="ListBullet"/>
+      </w:pPr>
+      <w:r>
+        <w:t xml:space="preserve">☑ </w:t>
+      </w:r>
+      <w:r>
+        <w:rPr>
+          <w:rFonts w:ascii="Courier New" w:hAnsi="Courier New"/>
+          <w:sz w:val="20"/>
+        </w:rPr>
+        <w:t>school_closures</w:t>
+      </w:r>
+      <w:r>
+        <w:t xml:space="preserve"> table + admin Settings CRUD section for snow days / in-service days</w:t>
+      </w:r>
+    </w:p>
+    <w:p>
+      <w:pPr>
+        <w:pStyle w:val="ListBullet"/>
+      </w:pPr>
+      <w:r>
+        <w:t xml:space="preserve">☑ </w:t>
+      </w:r>
+      <w:r>
+        <w:t>Admin Settings: country + state/region holiday calendar picker (</w:t>
+      </w:r>
+      <w:r>
+        <w:rPr>
+          <w:rFonts w:ascii="Courier New" w:hAnsi="Courier New"/>
+          <w:sz w:val="20"/>
+        </w:rPr>
+        <w:t>GET /api/admin/holiday-options</w:t>
+      </w:r>
+      <w:r>
+        <w:t xml:space="preserve">, sourced from the </w:t>
+      </w:r>
+      <w:r>
+        <w:rPr>
+          <w:rFonts w:ascii="Courier New" w:hAnsi="Courier New"/>
+          <w:sz w:val="20"/>
+        </w:rPr>
+        <w:t>holidays</w:t>
+      </w:r>
+      <w:r>
+        <w:t xml:space="preserve"> package; defaults to US federal)</w:t>
+      </w:r>
+    </w:p>
+    <w:p>
+      <w:pPr>
+        <w:pStyle w:val="ListBullet"/>
+      </w:pPr>
+      <w:r>
+        <w:t xml:space="preserve">☑ </w:t>
+      </w:r>
+      <w:r>
+        <w:t xml:space="preserve">Splash + Home banner ("No school today — </w:t>
+      </w:r>
+      <w:r>
+        <w:rPr>
+          <w:i/>
+        </w:rPr>
+        <w:t>holiday</w:t>
+      </w:r>
+      <w:r>
+        <w:t xml:space="preserve"> · </w:t>
+      </w:r>
+      <w:r>
+        <w:rPr>
+          <w:i/>
+        </w:rPr>
+        <w:t>N</w:t>
+      </w:r>
+      <w:r>
+        <w:t xml:space="preserve"> school-day steps hidden") for holidays/closures only — weekends skipped (already obvious)</w:t>
+      </w:r>
+    </w:p>
+    <w:p>
+      <w:pPr>
+        <w:pStyle w:val="ListBullet"/>
+      </w:pPr>
+      <w:r>
+        <w:t xml:space="preserve">☑ </w:t>
+      </w:r>
+      <w:r>
+        <w:t xml:space="preserve">Routines whose only remaining steps are all </w:t>
+      </w:r>
+      <w:r>
+        <w:rPr>
+          <w:rFonts w:ascii="Courier New" w:hAnsi="Courier New"/>
+          <w:sz w:val="20"/>
+        </w:rPr>
+        <w:t>school_day_only</w:t>
+      </w:r>
+      <w:r>
+        <w:t xml:space="preserve"> on a non-school day are dropped from Splash/Home and treated as non-scheduled by the streak walk (streak preserved, never extended)</w:t>
+      </w:r>
+    </w:p>
+    <w:p>
+      <w:pPr>
+        <w:pStyle w:val="ListBullet"/>
+      </w:pPr>
+      <w:r>
+        <w:t xml:space="preserve">☑ </w:t>
+      </w:r>
+      <w:r>
+        <w:t>Per-step "Only on school days" checkbox + bulk-toggle button in the routine editor</w:t>
+      </w:r>
+    </w:p>
+    <w:p>
+      <w:pPr>
+        <w:pStyle w:val="ListBullet"/>
+      </w:pPr>
+      <w:r>
+        <w:t xml:space="preserve">☑ </w:t>
+      </w:r>
+      <w:r>
+        <w:t>🎉 "All routines done" celebratory empty-state card on Splash + Home when today's scheduled routines are all complete</w:t>
+      </w:r>
+    </w:p>
+    <w:p>
+      <w:pPr>
+        <w:pStyle w:val="ListBullet"/>
+      </w:pPr>
+      <w:r>
+        <w:t xml:space="preserve">☑ </w:t>
+      </w:r>
+      <w:r>
+        <w:t>Profile-colored streak chip on Splash routine pills (</w:t>
+      </w:r>
+      <w:r>
+        <w:rPr>
+          <w:rFonts w:ascii="Courier New" w:hAnsi="Courier New"/>
+          <w:sz w:val="20"/>
+        </w:rPr>
+        <w:t>&lt;name&gt; · 🔥 N</w:t>
+      </w:r>
+      <w:r>
+        <w:t>) — replaced the standalone amber badge</w:t>
+      </w:r>
+    </w:p>
+    <w:p>
+      <w:pPr>
+        <w:pStyle w:val="Heading2"/>
+      </w:pPr>
+      <w:r>
         <w:t>Phase 2 — Multi-Service Sync &amp; Polish</w:t>
       </w:r>
     </w:p>
@@ -10153,6 +10672,167 @@
             <w:r/>
             <w:r>
               <w:t>Header action that logs out the current profile and returns the device to the splash on demand, without waiting for the screensaver timeout.</w:t>
+            </w:r>
+          </w:p>
+        </w:tc>
+      </w:tr>
+      <w:tr>
+        <w:tc>
+          <w:tcPr>
+            <w:tcW w:type="dxa" w:w="4320"/>
+          </w:tcPr>
+          <w:p>
+            <w:r/>
+            <w:r>
+              <w:rPr>
+                <w:b/>
+              </w:rPr>
+              <w:t>School Day</w:t>
+            </w:r>
+          </w:p>
+        </w:tc>
+        <w:tc>
+          <w:tcPr>
+            <w:tcW w:type="dxa" w:w="4320"/>
+          </w:tcPr>
+          <w:p>
+            <w:r/>
+            <w:r>
+              <w:t xml:space="preserve">A weekday that is neither a holiday from the household's selected </w:t>
+            </w:r>
+            <w:r>
+              <w:rPr>
+                <w:rFonts w:ascii="Courier New" w:hAnsi="Courier New"/>
+                <w:sz w:val="20"/>
+              </w:rPr>
+              <w:t>holiday_country</w:t>
+            </w:r>
+            <w:r>
+              <w:t xml:space="preserve"> / </w:t>
+            </w:r>
+            <w:r>
+              <w:rPr>
+                <w:rFonts w:ascii="Courier New" w:hAnsi="Courier New"/>
+                <w:sz w:val="20"/>
+              </w:rPr>
+              <w:t>holiday_subdiv</w:t>
+            </w:r>
+            <w:r>
+              <w:t xml:space="preserve"> calendar nor an admin-marked </w:t>
+            </w:r>
+            <w:r>
+              <w:rPr>
+                <w:rFonts w:ascii="Courier New" w:hAnsi="Courier New"/>
+                <w:sz w:val="20"/>
+              </w:rPr>
+              <w:t>SchoolClosure</w:t>
+            </w:r>
+            <w:r>
+              <w:t xml:space="preserve">. Used to gate </w:t>
+            </w:r>
+            <w:r>
+              <w:rPr>
+                <w:rFonts w:ascii="Courier New" w:hAnsi="Courier New"/>
+                <w:sz w:val="20"/>
+              </w:rPr>
+              <w:t>school_day_only</w:t>
+            </w:r>
+            <w:r>
+              <w:t xml:space="preserve"> routine steps (US-2.3.7).</w:t>
+            </w:r>
+          </w:p>
+        </w:tc>
+      </w:tr>
+      <w:tr>
+        <w:tc>
+          <w:tcPr>
+            <w:tcW w:type="dxa" w:w="4320"/>
+          </w:tcPr>
+          <w:p>
+            <w:r/>
+            <w:r>
+              <w:rPr>
+                <w:b/>
+              </w:rPr>
+              <w:t>School Closure</w:t>
+            </w:r>
+          </w:p>
+        </w:tc>
+        <w:tc>
+          <w:tcPr>
+            <w:tcW w:type="dxa" w:w="4320"/>
+          </w:tcPr>
+          <w:p>
+            <w:r/>
+            <w:r>
+              <w:t xml:space="preserve">An admin-entered non-school date (snow day, in-service day, parent-teacher conference) stored in the </w:t>
+            </w:r>
+            <w:r>
+              <w:rPr>
+                <w:rFonts w:ascii="Courier New" w:hAnsi="Courier New"/>
+                <w:sz w:val="20"/>
+              </w:rPr>
+              <w:t>school_closures</w:t>
+            </w:r>
+            <w:r>
+              <w:t xml:space="preserve"> table with an optional reason.</w:t>
+            </w:r>
+          </w:p>
+        </w:tc>
+      </w:tr>
+      <w:tr>
+        <w:tc>
+          <w:tcPr>
+            <w:tcW w:type="dxa" w:w="4320"/>
+          </w:tcPr>
+          <w:p>
+            <w:r/>
+            <w:r>
+              <w:rPr>
+                <w:b/>
+              </w:rPr>
+              <w:t>Holiday Calendar</w:t>
+            </w:r>
+          </w:p>
+        </w:tc>
+        <w:tc>
+          <w:tcPr>
+            <w:tcW w:type="dxa" w:w="4320"/>
+          </w:tcPr>
+          <w:p>
+            <w:r/>
+            <w:r>
+              <w:t>The country (and optional state/region) selected in admin settings (</w:t>
+            </w:r>
+            <w:r>
+              <w:rPr>
+                <w:rFonts w:ascii="Courier New" w:hAnsi="Courier New"/>
+                <w:sz w:val="20"/>
+              </w:rPr>
+              <w:t>holiday_country</w:t>
+            </w:r>
+            <w:r>
+              <w:t xml:space="preserve"> / </w:t>
+            </w:r>
+            <w:r>
+              <w:rPr>
+                <w:rFonts w:ascii="Courier New" w:hAnsi="Courier New"/>
+                <w:sz w:val="20"/>
+              </w:rPr>
+              <w:t>holiday_subdiv</w:t>
+            </w:r>
+            <w:r>
+              <w:t xml:space="preserve">); resolved at runtime via the Python </w:t>
+            </w:r>
+            <w:r>
+              <w:rPr>
+                <w:rFonts w:ascii="Courier New" w:hAnsi="Courier New"/>
+                <w:sz w:val="20"/>
+              </w:rPr>
+              <w:t>holidays</w:t>
+            </w:r>
+            <w:r>
+              <w:t xml:space="preserve"> package.</w:t>
             </w:r>
           </w:p>
         </w:tc>

</xml_diff>

<commit_message>
PRD: check off DnD reordering + JSON backup in Phase 2 backlog
Both shipped earlier this session (commits 8c99e5f and 0f383a3); the
backlog lines were missed.

Co-authored-by: Copilot <223556219+Copilot@users.noreply.github.com>
</commit_message>
<xml_diff>
--- a/PRD_Family_Hub_Display_v2.docx
+++ b/PRD_Family_Hub_Display_v2.docx
@@ -10257,10 +10257,21 @@
         <w:pStyle w:val="ListBullet"/>
       </w:pPr>
       <w:r>
+        <w:t xml:space="preserve">☑ </w:t>
+      </w:r>
+      <w:r>
+        <w:t>Drag-and-drop reordering for list items and routine steps</w:t>
+      </w:r>
+    </w:p>
+    <w:p>
+      <w:pPr>
+        <w:pStyle w:val="ListBullet"/>
+      </w:pPr>
+      <w:r>
         <w:t xml:space="preserve">☐ </w:t>
       </w:r>
       <w:r>
-        <w:t>Drag-and-drop reordering for list items and routine steps</w:t>
+        <w:t>Photo integration with Google Photos album</w:t>
       </w:r>
     </w:p>
     <w:p>
@@ -10268,18 +10279,7 @@
         <w:pStyle w:val="ListBullet"/>
       </w:pPr>
       <w:r>
-        <w:t xml:space="preserve">☐ </w:t>
-      </w:r>
-      <w:r>
-        <w:t>Photo integration with Google Photos album</w:t>
-      </w:r>
-    </w:p>
-    <w:p>
-      <w:pPr>
-        <w:pStyle w:val="ListBullet"/>
-      </w:pPr>
-      <w:r>
-        <w:t xml:space="preserve">☐ </w:t>
+        <w:t xml:space="preserve">☑ </w:t>
       </w:r>
       <w:r>
         <w:t>Export/import household data (JSON backup)</w:t>

</xml_diff>